<commit_message>
chore: snapshot state before final review loop
</commit_message>
<xml_diff>
--- a/docs/Пояснительная_записка_Москоллектор_НейроКонтур.docx
+++ b/docs/Пояснительная_записка_Москоллектор_НейроКонтур.docx
@@ -48,7 +48,7 @@
           <w:color w:val="50505A"/>
           <w:sz w:val="22"/>
         </w:rPr>
-        <w:t>Интеллектуальный программный комплекс предиктивного мониторинга деградации датчиков СМВУ, фильтрации ложных тревог и автоматизации наряд-заказов на ТО/ППР подземных коллекторов Москвы</w:t>
+        <w:t>Локальный демонстрационный прототип для анализа телеметрических признаков, показа ML-оценок и формирования черновиков диспетчерских действий. Целевые метки модели сформированы алгоритмически по будущей телеметрии и не подтверждают реальные ремонты, аварии или предотвращённые события.</w:t>
       </w:r>
     </w:p>
     <w:tbl>
@@ -70,6 +70,9 @@
         <w:gridCol w:w="4658"/>
       </w:tblGrid>
       <w:tr>
+        <w:trPr>
+          <w:cantSplit/>
+        </w:trPr>
         <w:tc>
           <w:tcPr>
             <w:tcW w:type="dxa" w:w="3168"/>
@@ -120,6 +123,9 @@
         </w:tc>
       </w:tr>
       <w:tr>
+        <w:trPr>
+          <w:cantSplit/>
+        </w:trPr>
         <w:tc>
           <w:tcPr>
             <w:tcW w:type="dxa" w:w="3168"/>
@@ -170,6 +176,9 @@
         </w:tc>
       </w:tr>
       <w:tr>
+        <w:trPr>
+          <w:cantSplit/>
+        </w:trPr>
         <w:tc>
           <w:tcPr>
             <w:tcW w:type="dxa" w:w="3168"/>
@@ -214,12 +223,15 @@
                 <w:rFonts w:ascii="Arial" w:hAnsi="Arial"/>
                 <w:sz w:val="18"/>
               </w:rPr>
-              <w:t>Комплекс коммуникационных коллекторов г. Москвы (825 км, 11 500+ датчиков СМВУ)</w:t>
+              <w:t>Инфраструктура по описанию кейса; фактические данные и геопривязка заказчика не проверялись</w:t>
             </w:r>
           </w:p>
         </w:tc>
       </w:tr>
       <w:tr>
+        <w:trPr>
+          <w:cantSplit/>
+        </w:trPr>
         <w:tc>
           <w:tcPr>
             <w:tcW w:type="dxa" w:w="3168"/>
@@ -264,12 +276,15 @@
                 <w:rFonts w:ascii="Arial" w:hAnsi="Arial"/>
                 <w:sz w:val="18"/>
               </w:rPr>
-              <w:t>Р ТЭК, ГОСТ Р 53195 (Human-in-the-Loop), 149-ФЗ (КИИ, Read-only), 152-ФЗ (ПДн)</w:t>
+              <w:t>Применимые регламенты и требования требуется согласовать; соответствие стандартам не заявляется</w:t>
             </w:r>
           </w:p>
         </w:tc>
       </w:tr>
       <w:tr>
+        <w:trPr>
+          <w:cantSplit/>
+        </w:trPr>
         <w:tc>
           <w:tcPr>
             <w:tcW w:type="dxa" w:w="3168"/>
@@ -320,6 +335,9 @@
         </w:tc>
       </w:tr>
       <w:tr>
+        <w:trPr>
+          <w:cantSplit/>
+        </w:trPr>
         <w:tc>
           <w:tcPr>
             <w:tcW w:type="dxa" w:w="3168"/>
@@ -364,7 +382,7 @@
                 <w:rFonts w:ascii="Arial" w:hAnsi="Arial"/>
                 <w:sz w:val="18"/>
               </w:rPr>
-              <w:t>Полный функциональный прототип, REST API, Web UI, Benchmark 57.4 мс (SLA &lt; 300с)</w:t>
+              <w:t>Локальный прототип: REST API, Web UI и экспериментальный ML-скоринг; производственное внедрение и SLA не подтверждены</w:t>
             </w:r>
           </w:p>
         </w:tc>
@@ -400,7 +418,7 @@
           <w:color w:val="282828"/>
           <w:sz w:val="19"/>
         </w:rPr>
-        <w:t>АО «Москоллектор» осуществляет непрерывную эксплуатацию крупнейшего в мире подземного коллекторного хозяйства протяженностью свыше 825 км. В подземных галереях сосредоточена жизненно важная городская инфраструктура столицы: более 19,7 тыс. км кабелей связи, 8,3 тыс. км силовых кабелей напряжением до 20 кВ, а также 1,9 тыс. км трубопроводов теплосети и водоснабжения. Отказ или повреждение коммуникаций в коллекторе несет прямую угрозу бесперебойному жизнеобеспечению 13-миллионного мегаполиса.</w:t>
+        <w:t>В описании кейса заказчика указаны подземные коммуникационные коллекторы Москвы протяжённостью около 825 км и их инженерная инфраструктура. Эти сведения приведены как контекст технического задания и не являются результатом независимой проверки команды.</w:t>
       </w:r>
     </w:p>
     <w:p>
@@ -413,7 +431,7 @@
           <w:color w:val="282828"/>
           <w:sz w:val="19"/>
         </w:rPr>
-        <w:t>Контроль технологических параметров и физической безопасности коллекторов обеспечивается Системой мониторинга и верхнего уровня (СМВУ), объединяющей более 11,5 тыс. датчиков и исполнительных устройств (датчики метана, угарного газа, температуры, затопления, дыма, объема движения, положения люков, работы насосов и вентиляционных установок). В Объединенную диспетчерскую службу (ОДС) ежемесячно поступает свыше 30 миллионов технологических записей.</w:t>
+        <w:t>Техническое задание описывает СМВУ и большой поток показаний датчиков. Представленный прототип работает с доступным локальным набором признаков и демонстрационными сценариями; подключения к рабочей системе мониторинга АО «Москоллектор» нет.</w:t>
       </w:r>
     </w:p>
     <w:p>
@@ -427,7 +445,7 @@
           <w:color w:val="191919"/>
           <w:sz w:val="19"/>
         </w:rPr>
-        <w:t xml:space="preserve">Проблематика: </w:t>
+        <w:t>Ограничения доказательной базы</w:t>
       </w:r>
       <w:r>
         <w:rPr>
@@ -435,7 +453,6 @@
           <w:color w:val="282828"/>
           <w:sz w:val="19"/>
         </w:rPr>
-        <w:t>Ключевые вызовы текущей эксплуатации:</w:t>
       </w:r>
     </w:p>
     <w:p>
@@ -448,7 +465,7 @@
           <w:rFonts w:ascii="Arial" w:hAnsi="Arial"/>
           <w:sz w:val="19"/>
         </w:rPr>
-        <w:t>Колоссальный поток ложных тревог: до 80% срабатываний в СМВУ вызваны аппаратным дребезгом концевых выключателей, деградацией сенсоров и наводками кабельных линий. Диспетчеры тратят рабочее время на рутинную фильтрацию шума вместо оперативного контроля аварийных участков.</w:t>
+        <w:t>В предоставленном наборе нет подтверждённых актов ремонтов, выездов или внешних CMMS/1С:ТОИР результатов. Поэтому доля ложных тревог, количество предотвращённых инцидентов и операционная экономия заказчика не измерены.</w:t>
       </w:r>
     </w:p>
     <w:p>
@@ -461,7 +478,7 @@
           <w:rFonts w:ascii="Arial" w:hAnsi="Arial"/>
           <w:sz w:val="19"/>
         </w:rPr>
-        <w:t>Необоснованные холостые выезды бригад: каждый выезд аварийно-ремонтной группы на ложное срабатывание отвлекает дежурные силы и обходится предприятию в среднем в 18 500 рублей.</w:t>
+        <w:t>Суммы 18 500 ₽ за выезд и 3 200 ₽ за плановое обслуживание используются только как сценарные вводные в арифметическом примере ниже. Их источник, применимость и актуальные нормативы требуется подтвердить с заказчиком.</w:t>
       </w:r>
     </w:p>
     <w:p>
@@ -474,7 +491,7 @@
           <w:rFonts w:ascii="Arial" w:hAnsi="Arial"/>
           <w:sz w:val="19"/>
         </w:rPr>
-        <w:t>Отсутствие упреждающего контроля: традиционные системы SCADA реагируют на факт свершившегося инцидента. В условиях подземной среды задержка реакции на перегрев силового кабеля или скопление метана чревата катастрофическими последствиями.</w:t>
+        <w:t>В прототипе не настроен обмен со SCADA/СМВУ и нет работающего контура предиктивного мониторинга объекта. Модель оценивает записи локального набора; реальные условия эксплуатации и безопасность реакции требуют отдельной проверки.</w:t>
       </w:r>
     </w:p>
     <w:p>
@@ -487,7 +504,7 @@
           <w:rFonts w:ascii="Arial" w:hAnsi="Arial"/>
           <w:sz w:val="19"/>
         </w:rPr>
-        <w:t>Сложность локализации и маршрутизации: коллектор разбит на пикеты (ПК), и автоматическое сопоставление сработавшего датчика со специализированной службой (КИПиА, электротехническая, строительная) и набором ЗИП до настоящего времени требовало ручной работы.</w:t>
+        <w:t>Пикетаж, назначение службы и демонстрационная карта не подтверждены геоданными заказчика. Прототип показывает условные маршруты процесса и черновики, а не навигацию бригады или согласованную диспетчерскую маршрутизацию.</w:t>
       </w:r>
     </w:p>
     <w:p>
@@ -500,7 +517,7 @@
           <w:color w:val="282828"/>
           <w:sz w:val="19"/>
         </w:rPr>
-        <w:t>Цель проекта «Москоллектор.НейроКонтур» — создание промышленного программного комплекса предиктивной аналитики, подавляющего до 82.4% ложных срабатываний, прогнозирующего предаварийную деградацию датчиков на горизонте 24–72 часов, и автоматически генерирующего наряд-заказы на планово-предупредительный ремонт (ППР) с жестким соблюдением требований безопасности ГОСТ Р 53195.</w:t>
+        <w:t>Цель прототипа — показать обработку сигналов, ML-скоринг и действия специалиста в локальном интерфейсе. Это не подтверждённая промышленная система, не доказательство подавления ложных срабатываний и не заявление о соответствии ГОСТ или другим стандартам.</w:t>
       </w:r>
     </w:p>
     <w:p>
@@ -528,7 +545,7 @@
           <w:color w:val="282828"/>
           <w:sz w:val="19"/>
         </w:rPr>
-        <w:t>Программный комплекс спроектирован по модульному принципу в соответствии с микросервисной C4-моделью, обеспечивающей независимость сервисов, масштабируемость и полную автономность в закрытом контуре заказчика (Air-Gapped).</w:t>
+        <w:t>Локальная архитектура прототипа разделена на backend API, ML-скоринг, файлы демонстрационных данных и React-интерфейс. Микросервисность, автономная эксплуатация в закрытом контуре и готовность к производственному развёртыванию не подтверждены.</w:t>
       </w:r>
     </w:p>
     <w:tbl>
@@ -551,6 +568,9 @@
         <w:gridCol w:w="3106"/>
       </w:tblGrid>
       <w:tr>
+        <w:trPr>
+          <w:cantSplit/>
+        </w:trPr>
         <w:tc>
           <w:tcPr>
             <w:tcW w:type="dxa" w:w="3106"/>
@@ -616,6 +636,9 @@
         </w:tc>
       </w:tr>
       <w:tr>
+        <w:trPr>
+          <w:cantSplit/>
+        </w:trPr>
         <w:tc>
           <w:tcPr>
             <w:tcW w:type="dxa" w:w="3106"/>
@@ -669,12 +692,15 @@
               <w:rPr>
                 <w:sz w:val="17"/>
               </w:rPr>
-              <w:t>Стриминговая буферизация телеметрии, подавление дребезга за &lt;1 мс, первичная валидация временных меток.</w:t>
+              <w:t>Обработка локальных демонстрационных сигналов и первичная проверка временных/дискретных признаков; поведение на потоке СМВУ не валидировано</w:t>
             </w:r>
           </w:p>
         </w:tc>
       </w:tr>
       <w:tr>
+        <w:trPr>
+          <w:cantSplit/>
+        </w:trPr>
         <w:tc>
           <w:tcPr>
             <w:tcW w:type="dxa" w:w="3106"/>
@@ -728,12 +754,15 @@
               <w:rPr>
                 <w:sz w:val="17"/>
               </w:rPr>
-              <w:t>Пакетный и онлайн-скоринг рисков деградации каналов (10 712 датчиков), расчет вероятности отказа, Feature Importance.</w:t>
+              <w:t>Расчёт риск-оценки по признакам канала и отображение результата; тестовая цель — proxy-разметка, не подтверждённый отказ</w:t>
             </w:r>
           </w:p>
         </w:tc>
       </w:tr>
       <w:tr>
+        <w:trPr>
+          <w:cantSplit/>
+        </w:trPr>
         <w:tc>
           <w:tcPr>
             <w:tcW w:type="dxa" w:w="3106"/>
@@ -787,12 +816,15 @@
               <w:rPr>
                 <w:sz w:val="17"/>
               </w:rPr>
-              <w:t>Генерация наряд-заказов по регламенту Р ТЭК, привязка к пикетам (ПК1–120), Human-in-the-Loop фиксация решений диспетчера.</w:t>
+              <w:t>Локальные API-действия и черновики заявок; регламенты, пикетаж и маршрутизация требуют проверки заказчиком</w:t>
             </w:r>
           </w:p>
         </w:tc>
       </w:tr>
       <w:tr>
+        <w:trPr>
+          <w:cantSplit/>
+        </w:trPr>
         <w:tc>
           <w:tcPr>
             <w:tcW w:type="dxa" w:w="3106"/>
@@ -846,7 +878,7 @@
               <w:rPr>
                 <w:sz w:val="17"/>
               </w:rPr>
-              <w:t>Картографическая визуализация сети, интерактивный Live Sandbox инференса, управление системными порогами, журнал нарядов.</w:t>
+              <w:t>Локальная демонстрационная карта, сценарии и журнал действий; нет связи с рабочей GIS/SCADA/CMMS</w:t>
             </w:r>
           </w:p>
         </w:tc>
@@ -877,7 +909,7 @@
           <w:color w:val="282828"/>
           <w:sz w:val="19"/>
         </w:rPr>
-        <w:t>В соответствии со Стратегией развития строительной отрасли и ЖКХ РФ до 2030 года решение построено исключительно на открытых и свободных программных компонентах (Open Source), не использующих закрытых библиотек недружественных юрисдикций и облачных провайдеров. Комплекс полностью готов к развертыванию на отечественных операционных системах (Astra Linux, РЕД ОС) и серверах архитектуры x86-64 / Эльбрус / ARM.</w:t>
+        <w:t>Состав зависимостей и совместимость с целевыми отечественными ОС, процессорными архитектурами, требованиями КИИ и закрытым контуром требуют отдельной сборки и испытаний. Настоящий локальный запуск таких испытаний не заменяет.</w:t>
       </w:r>
     </w:p>
     <w:p>
@@ -905,7 +937,7 @@
           <w:color w:val="282828"/>
           <w:sz w:val="19"/>
         </w:rPr>
-        <w:t>В ходе разработки был проведен детальный аудит исходного архива СМВУ, содержащего 30 634 892 технологические записи по 10 712 уникальным каналам данных датчиков за январь 2026 года. Анализ выявил специфические особенности промышленного телеметрического потока.</w:t>
+        <w:t>Метрики модели рассчитаны для 11 485 каналов в train, validation и held-out test. Для разбора происхождения отдельных proxy-меток сформирован файл backend/data/reconciliation_ground_truth.json генератором python -m scripts.build_reconciliation_json: просмотрено 7 млн строк исходного CSV, приложены примеры proxy TP/FP/TN. CSV не поставляется в Git. Сверка с телеметрией не устанавливает факт ремонта или физического отказа.</w:t>
       </w:r>
     </w:p>
     <w:p>
@@ -933,7 +965,7 @@
           <w:color w:val="282828"/>
           <w:sz w:val="19"/>
         </w:rPr>
-        <w:t>Для дискретных датчиков (контакты дверей/люков, датчики движения, переключатели) характерны эпизоды кратковременного дребезга контактов — десятки циклов переключения 0-&gt;1-&gt;0 в течение нескольких секунд, вызываемые вибрацией от движения наземного транспорта, порывами вентиляционных струй или окислением герконов. Подобные события не несут информации об аварии.</w:t>
+        <w:t>Прототип содержит признаки и локальные сценарии для анализа кратковременных изменений дискретных сигналов. Наблюдение таких изменений само по себе не доказывает дребезг контакта, причину тревоги или отсутствие опасного события.</w:t>
       </w:r>
     </w:p>
     <w:p>
@@ -946,7 +978,7 @@
           <w:color w:val="282828"/>
           <w:sz w:val="19"/>
         </w:rPr>
-        <w:t>Реализован потоковый алгоритм скользящего окна (Stream Sliding Window). Если в окне длительностью W секунд (по умолчанию W = 300с) число изменений логического состояния превышает порог N_flips (по умолчанию N_flips = 4), событие классифицируется как дребезг с вероятностью P_chatter &gt; 0.85. В ОДС передается рекомендация классифицировать инцидент как «Технический дребезг», что отменяет ложный экстренный выезд и ставит задачу на плановую регулировку концевика.</w:t>
+        <w:t>Демонстрационный фильтр помечает кандидатов на шум по заданным параметрам и оставляет решение специалисту. Его метки не отменяют реальный выезд и не являются подтверждённой классификацией событий СМВУ.</w:t>
       </w:r>
     </w:p>
     <w:p>
@@ -975,7 +1007,7 @@
           <w:color w:val="191919"/>
           <w:sz w:val="19"/>
         </w:rPr>
-        <w:t xml:space="preserve">Физическое обоснование: </w:t>
+        <w:t>В признаках встречаются некорректные временные значения, в том числе epoch 1970 года. Это наблюдение по данным, а не установленный аппаратный диагноз.</w:t>
       </w:r>
       <w:r>
         <w:rPr>
@@ -983,7 +1015,6 @@
           <w:color w:val="282828"/>
           <w:sz w:val="19"/>
         </w:rPr>
-        <w:t>В журнале СМВУ зафиксирован массив записей с временной меткой Unix Epoch (1970-01-01 00:00:00). Проведено инженерно-физическое исследование природы данного феномена:</w:t>
       </w:r>
     </w:p>
     <w:p>
@@ -996,7 +1027,7 @@
           <w:rFonts w:ascii="Arial" w:hAnsi="Arial"/>
           <w:sz w:val="19"/>
         </w:rPr>
-        <w:t>Аппаратный сброс контроллера: При падении напряжения основного питания контроллера сбора данных (УСПД/PLC) и разряде резервного аккумулятора встроенные часы реального времени (RTC) сбрасываются в нулевое значение 01.01.1970.</w:t>
+        <w:t>Наличие epoch-метки не позволяет определить, вызвана ли она сбросом часов, экспортом или обработкой данных. Причина требует сверки с источником и журналами оборудования.</w:t>
       </w:r>
     </w:p>
     <w:p>
@@ -1009,7 +1040,7 @@
           <w:rFonts w:ascii="Arial" w:hAnsi="Arial"/>
           <w:sz w:val="19"/>
         </w:rPr>
-        <w:t>Связь с предаварийным состоянием: Появление записей с датой 1970 года коррелирует с глубокой деградацией блока питания датчика и линий электропитания. В нашей модели факт наличия сбросов RTC выделен в отдельный предиктивный признак `has_epoch_reset`, сигнализирующий о неизбежном отказе канала в течение 48 часов.</w:t>
+        <w:t>В отчёте модели есть признак date_corruptions. Его наличие не доказывает физическую деградацию питания и не подтверждает прогноз отказа в заданный срок.</w:t>
       </w:r>
     </w:p>
     <w:p>
@@ -1037,7 +1068,7 @@
           <w:color w:val="282828"/>
           <w:sz w:val="19"/>
         </w:rPr>
-        <w:t>Одной из главных ошибок прототипов на хакатонах является подгонка порогов под тестовую выборку (Target Leakage / Data Leakage) и использование случайного перемешивания (K-Fold CV) на временных рядах. В проекте «НейроКонтур» реализован строгий научно-обоснованный протокол валидации Out-of-Time 3-Way Split.</w:t>
+        <w:t>Оценка использует временное разделение train/validation/test, указанное в metrics_report.json. Это снижает риск утечки между временными частями, но не заменяет независимый аудит данных и методики.</w:t>
       </w:r>
     </w:p>
     <w:p>
@@ -1066,7 +1097,7 @@
           <w:color w:val="191919"/>
           <w:sz w:val="19"/>
         </w:rPr>
-        <w:t xml:space="preserve">Хронологические интервалы: </w:t>
+        <w:t>Временные интервалы и целевые метки трактуются как экспериментальная proxy-разметка по будущей телеметрии:</w:t>
       </w:r>
       <w:r>
         <w:rPr>
@@ -1074,7 +1105,6 @@
           <w:color w:val="282828"/>
           <w:sz w:val="19"/>
         </w:rPr>
-        <w:t>Данные разделены строго по хронологической оси без заглядывания в будущее:</w:t>
       </w:r>
     </w:p>
     <w:p>
@@ -1087,7 +1117,7 @@
           <w:rFonts w:ascii="Arial" w:hAnsi="Arial"/>
           <w:sz w:val="19"/>
         </w:rPr>
-        <w:t>Обучающая выборка (Train): 01.01.2026 – 14.01.2026 (10 712 каналов, 120 событий аномалии). Построение агрегатных признаков телеметрии и обучение ансамбля.</w:t>
+        <w:t>Обучающая часть: даты, размеры выборки и 120 proxy-positive меток приведены в отчёте модели. Это алгоритмические целевые значения, не подтверждённые случаи ремонта или аварии.</w:t>
       </w:r>
     </w:p>
     <w:p>
@@ -1100,7 +1130,7 @@
           <w:rFonts w:ascii="Arial" w:hAnsi="Arial"/>
           <w:sz w:val="19"/>
         </w:rPr>
-        <w:t>Валидационная выборка (Validation): 15.01.2026 – 21.01.2026 (10 712 каналов, 105 событий аномалии). Подбор гиперпараметров и калибровка порога отсечки риска tau.</w:t>
+        <w:t>Валидационная часть: 105 proxy-positive меток по отчёту модели; используется для выбора порога. Метки не подтверждены эксплуатационными актами.</w:t>
       </w:r>
     </w:p>
     <w:p>
@@ -1113,7 +1143,7 @@
           <w:rFonts w:ascii="Arial" w:hAnsi="Arial"/>
           <w:sz w:val="19"/>
         </w:rPr>
-        <w:t>Отложенная тестовая выборка (Held-out Test): 22.01.2026 – 28.01.2026 (10 712 каналов). Строго изолированный слепой тест. Прогноз сопоставляется с событиями критической аномалии / предотказного состояния на горизонте 24–72 часа вперед.</w:t>
+        <w:t>Held-out test: признаки ограничены датами по 28 января; 174 proxy-positive канала сопоставлены с будущей телеметрией в окне 29–31 января. Положительная метка означает совпадение с алгоритмическим правилом, а не подтверждённый инцидент.</w:t>
       </w:r>
     </w:p>
     <w:p>
@@ -1141,7 +1171,7 @@
           <w:color w:val="282828"/>
           <w:sz w:val="19"/>
         </w:rPr>
-        <w:t>В реальной коллекторной сети предаварийные состояния и критические аномалии датчиков являются редкими событиями: на отложенном тестовом интервале из 10 712 активных каналов события критической аномалии телеметрии (загазованность &gt;5%, температура &gt;40°C, сброс часов в 1970г, обрыв связи/питания) зафиксированы на 173 каналах (доля позитивного класса 1.61%). В предоставленном датасете внешние акты закрытия ремонтов CMMS отсутствуют, поэтому целевая переменная сформирована строго алгоритмически по будущему окну телеметрии, исключая заглядывание в будущее и утечку целевого признака.</w:t>
+        <w:t>Для модели тестовый набор содержит 11 485 каналов, из них 174 (1,51%) имеют положительную proxy-метку по будущей телеметрии. Внешних актов закрытия ремонтов/выездов нет; физическое предотказное состояние по этой разметке не подтверждено.</w:t>
       </w:r>
     </w:p>
     <w:p>
@@ -1154,7 +1184,7 @@
           <w:color w:val="282828"/>
           <w:sz w:val="19"/>
         </w:rPr>
-        <w:t>В условиях дисбаланса 1:62 стандартная точность (Accuracy) не имеет смысла (константный классификатор дает 98.4%). Для объективной оценки качества использованы метрики ранжирования ROC-AUC и PR-AUC (Precision-Recall AUC).</w:t>
+        <w:t>При редких положительных метках одной accuracy недостаточно. Отчёт содержит PR-AUC, ROC-AUC, precision и recall; их следует читать как качество воспроизведения алгоритмической proxy-цели на отложенной части.</w:t>
       </w:r>
     </w:p>
     <w:tbl>
@@ -1179,6 +1209,9 @@
         <w:gridCol w:w="1863"/>
       </w:tblGrid>
       <w:tr>
+        <w:trPr>
+          <w:cantSplit/>
+        </w:trPr>
         <w:tc>
           <w:tcPr>
             <w:tcW w:type="dxa" w:w="1863"/>
@@ -1196,7 +1229,7 @@
                 <w:b/>
                 <w:sz w:val="17"/>
               </w:rPr>
-              <w:t>Модель</w:t>
+              <w:t>Модель (порог)</w:t>
             </w:r>
           </w:p>
         </w:tc>
@@ -1259,7 +1292,7 @@
                 <w:b/>
                 <w:sz w:val="17"/>
               </w:rPr>
-              <w:t>Полнота (Recall)</w:t>
+              <w:t>Recall</w:t>
             </w:r>
           </w:p>
         </w:tc>
@@ -1280,12 +1313,15 @@
                 <w:b/>
                 <w:sz w:val="17"/>
               </w:rPr>
-              <w:t>Точность (Precision)</w:t>
+              <w:t>Precision</w:t>
             </w:r>
           </w:p>
         </w:tc>
       </w:tr>
       <w:tr>
+        <w:trPr>
+          <w:cantSplit/>
+        </w:trPr>
         <w:tc>
           <w:tcPr>
             <w:tcW w:type="dxa" w:w="1863"/>
@@ -1301,7 +1337,7 @@
               <w:rPr>
                 <w:sz w:val="17"/>
               </w:rPr>
-              <w:t>Случайный бейзлайн (Zero-Rule)</w:t>
+              <w:t>Zero-rule (baseline)</w:t>
             </w:r>
           </w:p>
         </w:tc>
@@ -1320,7 +1356,7 @@
               <w:rPr>
                 <w:sz w:val="17"/>
               </w:rPr>
-              <w:t>0.5000</w:t>
+              <w:t>—</w:t>
             </w:r>
           </w:p>
         </w:tc>
@@ -1339,7 +1375,7 @@
               <w:rPr>
                 <w:sz w:val="17"/>
               </w:rPr>
-              <w:t>0.0162</w:t>
+              <w:t>—</w:t>
             </w:r>
           </w:p>
         </w:tc>
@@ -1358,7 +1394,7 @@
               <w:rPr>
                 <w:sz w:val="17"/>
               </w:rPr>
-              <w:t>0.0%</w:t>
+              <w:t>0,0%</w:t>
             </w:r>
           </w:p>
         </w:tc>
@@ -1377,12 +1413,15 @@
               <w:rPr>
                 <w:sz w:val="17"/>
               </w:rPr>
-              <w:t>0.0%</w:t>
+              <w:t>0,0%</w:t>
             </w:r>
           </w:p>
         </w:tc>
       </w:tr>
       <w:tr>
+        <w:trPr>
+          <w:cantSplit/>
+        </w:trPr>
         <w:tc>
           <w:tcPr>
             <w:tcW w:type="dxa" w:w="1863"/>
@@ -1398,7 +1437,7 @@
               <w:rPr>
                 <w:sz w:val="17"/>
               </w:rPr>
-              <w:t>Логистическая регрессия (High-Recall)</w:t>
+              <w:t>Logistic Regression (0,80)</w:t>
             </w:r>
           </w:p>
         </w:tc>
@@ -1417,7 +1456,7 @@
               <w:rPr>
                 <w:sz w:val="17"/>
               </w:rPr>
-              <w:t>0.8313</w:t>
+              <w:t>0,8247</w:t>
             </w:r>
           </w:p>
         </w:tc>
@@ -1436,7 +1475,7 @@
               <w:rPr>
                 <w:sz w:val="17"/>
               </w:rPr>
-              <w:t>0.1925</w:t>
+              <w:t>0,1898</w:t>
             </w:r>
           </w:p>
         </w:tc>
@@ -1455,7 +1494,7 @@
               <w:rPr>
                 <w:sz w:val="17"/>
               </w:rPr>
-              <w:t>67.8%</w:t>
+              <w:t>67,82%</w:t>
             </w:r>
           </w:p>
         </w:tc>
@@ -1474,12 +1513,15 @@
               <w:rPr>
                 <w:sz w:val="17"/>
               </w:rPr>
-              <w:t>16.7%</w:t>
+              <w:t>14,82%</w:t>
             </w:r>
           </w:p>
         </w:tc>
       </w:tr>
       <w:tr>
+        <w:trPr>
+          <w:cantSplit/>
+        </w:trPr>
         <w:tc>
           <w:tcPr>
             <w:tcW w:type="dxa" w:w="1863"/>
@@ -1495,7 +1537,7 @@
               <w:rPr>
                 <w:sz w:val="17"/>
               </w:rPr>
-              <w:t>Случайный лес (High-Precision)</w:t>
+              <w:t>Random Forest (0,7695)</w:t>
             </w:r>
           </w:p>
         </w:tc>
@@ -1514,7 +1556,7 @@
               <w:rPr>
                 <w:sz w:val="17"/>
               </w:rPr>
-              <w:t>0.7020</w:t>
+              <w:t>0,7335</w:t>
             </w:r>
           </w:p>
         </w:tc>
@@ -1533,7 +1575,7 @@
               <w:rPr>
                 <w:sz w:val="17"/>
               </w:rPr>
-              <w:t>0.1569</w:t>
+              <w:t>0,1606</w:t>
             </w:r>
           </w:p>
         </w:tc>
@@ -1552,7 +1594,7 @@
               <w:rPr>
                 <w:sz w:val="17"/>
               </w:rPr>
-              <w:t>14.9%</w:t>
+              <w:t>10,34%</w:t>
             </w:r>
           </w:p>
         </w:tc>
@@ -1571,12 +1613,15 @@
               <w:rPr>
                 <w:sz w:val="17"/>
               </w:rPr>
-              <w:t>51.0%</w:t>
+              <w:t>45,00%</w:t>
             </w:r>
           </w:p>
         </w:tc>
       </w:tr>
       <w:tr>
+        <w:trPr>
+          <w:cantSplit/>
+        </w:trPr>
         <w:tc>
           <w:tcPr>
             <w:tcW w:type="dxa" w:w="1863"/>
@@ -1594,7 +1639,7 @@
                 <w:b/>
                 <w:sz w:val="17"/>
               </w:rPr>
-              <w:t>Чемпион: LightGBM GBDT</w:t>
+              <w:t>LightGBM (0,845)</w:t>
             </w:r>
           </w:p>
         </w:tc>
@@ -1615,7 +1660,7 @@
                 <w:b/>
                 <w:sz w:val="17"/>
               </w:rPr>
-              <w:t>0.7653</w:t>
+              <w:t>0,7710</w:t>
             </w:r>
           </w:p>
         </w:tc>
@@ -1636,7 +1681,7 @@
                 <w:b/>
                 <w:sz w:val="17"/>
               </w:rPr>
-              <w:t>0.1759</w:t>
+              <w:t>0,1679</w:t>
             </w:r>
           </w:p>
         </w:tc>
@@ -1657,7 +1702,7 @@
                 <w:b/>
                 <w:sz w:val="17"/>
               </w:rPr>
-              <w:t>18.4% (до 75%)</w:t>
+              <w:t>18,97%</w:t>
             </w:r>
           </w:p>
         </w:tc>
@@ -1678,7 +1723,7 @@
                 <w:b/>
                 <w:sz w:val="17"/>
               </w:rPr>
-              <w:t>16.7% (до 55%)</w:t>
+              <w:t>23,24%</w:t>
             </w:r>
           </w:p>
         </w:tc>
@@ -1694,7 +1739,7 @@
           <w:color w:val="282828"/>
           <w:sz w:val="19"/>
         </w:rPr>
-        <w:t>Чемпионская модель LightGBM обеспечивает PR-AUC = 0.1759, что в 10.9 раз превосходит случайный уровень (Lift = 10.9x). При ранжировании датчиков по вероятности деградации верхний дециль (Top-10%) концентрирует свыше 52% всех будущих аварий сети.</w:t>
+        <w:t>LightGBM на held-out test при пороге 0,845: PR-AUC 0,1679, ROC-AUC 0,7710, precision 0,2324, recall 0,1897. Результат относится к proxy-меткам, не к реальным авариям или ремонтам.</w:t>
       </w:r>
     </w:p>
     <w:p>
@@ -1722,7 +1767,7 @@
           <w:color w:val="282828"/>
           <w:sz w:val="19"/>
         </w:rPr>
-        <w:t>В разделе 10.3 ТЗ («Требования к показателям назначения») указано: «Целевые показатели точности (Precision) и полноты (Recall) определяются на этапе проектирования исходя из качества предоставляемых данных». В нашем решении порог отсечки tau сделан динамическим параметром системы (раздел 18.3 ТЗ), настраиваемым через диспетчерский интерфейс: при tau = 0.25 достигается максимальная полнота обнаружения аварий (Recall 67.8%), а при tau = 0.65 — высокая точность (Precision &gt; 50%), что позволяет диспетчеру адаптировать режим работы сервиса под текущую оперативную обстановку.</w:t>
+        <w:t>Порог — параметр компромисса, а не переключатель гарантированной точности. При рабочем tau = 0,42 у LightGBM precision 8,23%, recall 31,61% (55 TP, 613 FP, 119 FN, 10 698 TN относительно proxy-меток). Значения precision/recall зависят от порога и состава данных; перенос на реальные процессы не проверен.</w:t>
       </w:r>
     </w:p>
     <w:p>
@@ -1750,7 +1795,7 @@
           <w:color w:val="282828"/>
           <w:sz w:val="19"/>
         </w:rPr>
-        <w:t>В соответствии с техническими требованиями заказчика время полного цикла пересчета состояния датчиков коллекторной сети не должно превышать 300 секунд (5 минут). Для подтверждения характеристик быстродействия был проведен стресс-тест локального инференса на 100 независимых итерациях.</w:t>
+        <w:t>Локальный benchmark отчёта: пакетный расчёт 11 485 каналов — 62,86 мс, P95 — 70,65 мс; одиночный канал — 1,498 мс, P95 — 2,585 мс. Это замер инференса на тестовом стенде, а не SLA или сетевое испытание у заказчика.</w:t>
       </w:r>
     </w:p>
     <w:tbl>
@@ -1773,6 +1818,9 @@
         <w:gridCol w:w="3106"/>
       </w:tblGrid>
       <w:tr>
+        <w:trPr>
+          <w:cantSplit/>
+        </w:trPr>
         <w:tc>
           <w:tcPr>
             <w:tcW w:type="dxa" w:w="3106"/>
@@ -1790,7 +1838,7 @@
                 <w:b/>
                 <w:sz w:val="17"/>
               </w:rPr>
-              <w:t>Параметр производительности</w:t>
+              <w:t>Показатель</w:t>
             </w:r>
           </w:p>
         </w:tc>
@@ -1811,7 +1859,7 @@
                 <w:b/>
                 <w:sz w:val="17"/>
               </w:rPr>
-              <w:t>Требование ТЗ / SLA</w:t>
+              <w:t>Контекст</w:t>
             </w:r>
           </w:p>
         </w:tc>
@@ -1832,12 +1880,15 @@
                 <w:b/>
                 <w:sz w:val="17"/>
               </w:rPr>
-              <w:t>Фактический результат НейроКонтур</w:t>
+              <w:t>Локальный результат</w:t>
             </w:r>
           </w:p>
         </w:tc>
       </w:tr>
       <w:tr>
+        <w:trPr>
+          <w:cantSplit/>
+        </w:trPr>
         <w:tc>
           <w:tcPr>
             <w:tcW w:type="dxa" w:w="3106"/>
@@ -1853,7 +1904,7 @@
               <w:rPr>
                 <w:sz w:val="17"/>
               </w:rPr>
-              <w:t>Время скоринга всей сети (10 712 каналов)</w:t>
+              <w:t>Пакетный инференс (11 485 каналов)</w:t>
             </w:r>
           </w:p>
         </w:tc>
@@ -1872,7 +1923,7 @@
               <w:rPr>
                 <w:sz w:val="17"/>
               </w:rPr>
-              <w:t>&lt; 300 000 мс (300 с)</w:t>
+              <w:t>Локальный benchmark; не SLA сети заказчика</w:t>
             </w:r>
           </w:p>
         </w:tc>
@@ -1892,12 +1943,15 @@
                 <w:b/>
                 <w:sz w:val="17"/>
               </w:rPr>
-              <w:t>81.25 мс (P95: 107.82 мс) — в 3 692 раза быстрее SLA</w:t>
+              <w:t>62,86 мс (P95 70,65 мс)</w:t>
             </w:r>
           </w:p>
         </w:tc>
       </w:tr>
       <w:tr>
+        <w:trPr>
+          <w:cantSplit/>
+        </w:trPr>
         <w:tc>
           <w:tcPr>
             <w:tcW w:type="dxa" w:w="3106"/>
@@ -1913,7 +1967,7 @@
               <w:rPr>
                 <w:sz w:val="17"/>
               </w:rPr>
-              <w:t>Время скоринга 1 датчика (онлайн)</w:t>
+              <w:t>Один канал</w:t>
             </w:r>
           </w:p>
         </w:tc>
@@ -1932,7 +1986,7 @@
               <w:rPr>
                 <w:sz w:val="17"/>
               </w:rPr>
-              <w:t>&lt; 100 мс</w:t>
+              <w:t>Локальный benchmark</w:t>
             </w:r>
           </w:p>
         </w:tc>
@@ -1952,12 +2006,15 @@
                 <w:b/>
                 <w:sz w:val="17"/>
               </w:rPr>
-              <w:t>2.38 мс (P95: 4.44 мс)</w:t>
+              <w:t>1,498 мс (P95 2,585 мс)</w:t>
             </w:r>
           </w:p>
         </w:tc>
       </w:tr>
       <w:tr>
+        <w:trPr>
+          <w:cantSplit/>
+        </w:trPr>
         <w:tc>
           <w:tcPr>
             <w:tcW w:type="dxa" w:w="3106"/>
@@ -1973,7 +2030,7 @@
               <w:rPr>
                 <w:sz w:val="17"/>
               </w:rPr>
-              <w:t>Пропускная способность инференса</w:t>
+              <w:t>Throughput инференса</w:t>
             </w:r>
           </w:p>
         </w:tc>
@@ -1992,7 +2049,7 @@
               <w:rPr>
                 <w:sz w:val="17"/>
               </w:rPr>
-              <w:t>&gt; 500 каналов/сек</w:t>
+              <w:t>Локальная оценка</w:t>
             </w:r>
           </w:p>
         </w:tc>
@@ -2012,12 +2069,15 @@
                 <w:b/>
                 <w:sz w:val="17"/>
               </w:rPr>
-              <w:t>131 837 каналов/сек на CPU</w:t>
+              <w:t>182 697 каналов/с</w:t>
             </w:r>
           </w:p>
         </w:tc>
       </w:tr>
       <w:tr>
+        <w:trPr>
+          <w:cantSplit/>
+        </w:trPr>
         <w:tc>
           <w:tcPr>
             <w:tcW w:type="dxa" w:w="3106"/>
@@ -2033,7 +2093,7 @@
               <w:rPr>
                 <w:sz w:val="17"/>
               </w:rPr>
-              <w:t>Сетевой HTTP-стресс-тест API (500 TCP-запросов, 20 воркеров)</w:t>
+              <w:t>HTTP loopback (500 запросов, 20 воркеров)</w:t>
             </w:r>
           </w:p>
         </w:tc>
@@ -2052,7 +2112,7 @@
               <w:rPr>
                 <w:sz w:val="17"/>
               </w:rPr>
-              <w:t>100% доступность</w:t>
+              <w:t>TCP loopback, локальный стенд</w:t>
             </w:r>
           </w:p>
         </w:tc>
@@ -2072,7 +2132,7 @@
                 <w:b/>
                 <w:sz w:val="17"/>
               </w:rPr>
-              <w:t>500/500 OK (100%), 111.3 RPS, P50: 171.76 мс, P95: 252.44 мс</w:t>
+              <w:t>111,3 RPS; P50 171,76 мс; P95 252,44 мс</w:t>
             </w:r>
           </w:p>
         </w:tc>
@@ -2088,7 +2148,7 @@
           <w:color w:val="282828"/>
           <w:sz w:val="19"/>
         </w:rPr>
-        <w:t>Столь высокая скорость (81.25 мс на всю сеть Москвы) позволяет запускать пересчет предиктивной модели не раз в смену, а непрерывно в квазиреальном времени по мере поступления пачек телеметрии, обеспечивая мгновенную реакцию ОДС.</w:t>
+        <w:t>Отчёт также приводит throughput инференса 182 697 каналов/с и отдельный HTTP loopback тест: 500 запросов, 20 воркеров, 111,3 RPS, P50 171,76 мс, P95 252,44 мс. Эти стендовые числа не описывают задержку производственной сети.</w:t>
       </w:r>
     </w:p>
     <w:p>
@@ -2103,7 +2163,7 @@
           <w:color w:val="1C1D22"/>
           <w:sz w:val="30"/>
         </w:rPr>
-        <w:t>6. Система поддержки принятия решений и регламент ГОСТ Р 53195</w:t>
+        <w:t>6. Диспетчерское решение и локальные demo-учётки</w:t>
       </w:r>
     </w:p>
     <w:tbl>
@@ -2116,6 +2176,9 @@
         <w:gridCol w:w="9317"/>
       </w:tblGrid>
       <w:tr>
+        <w:trPr>
+          <w:cantSplit/>
+        </w:trPr>
         <w:tc>
           <w:tcPr>
             <w:tcW w:type="dxa" w:w="9360"/>
@@ -2144,7 +2207,7 @@
                 <w:color w:val="DC1446"/>
                 <w:sz w:val="18"/>
               </w:rPr>
-              <w:t xml:space="preserve">[ТРЕБОВАНИЕ ГОСТ Р 53195.1-2010] </w:t>
+              <w:t>Принцип безопасного локального демо: модель показывает кандидата/оценку, а решение остаётся за специалистом. Прототип не отменяет выезды и не заявляет соответствие стандартам или регламентам заказчика.</w:t>
             </w:r>
             <w:r>
               <w:rPr>
@@ -2152,7 +2215,6 @@
                 <w:color w:val="2D2D37"/>
                 <w:sz w:val="18"/>
               </w:rPr>
-              <w:t>Категорически недопустимо доверять алгоритмам машинного обучения автоматическую отмену выездов аварийных служб в системах жизнеобеспечения города без участия человека. Неконтролируемая ошибка модели (False Negative) в коллекторе может привести к взрыву метана, пожару силовых кабелей и затоплению тепломагистралей.</w:t>
             </w:r>
           </w:p>
         </w:tc>
@@ -2174,7 +2236,7 @@
           <w:color w:val="191919"/>
           <w:sz w:val="19"/>
         </w:rPr>
-        <w:t xml:space="preserve">Протокол работы ОДС: </w:t>
+        <w:t>В интерфейсе специалист может просмотреть результат локального сценария и сформировать черновик. Прототип не принимает решение об отмене выезда и не заменяет аварийный регламент.</w:t>
       </w:r>
       <w:r>
         <w:rPr>
@@ -2182,7 +2244,6 @@
           <w:color w:val="282828"/>
           <w:sz w:val="19"/>
         </w:rPr>
-        <w:t>В комплексе «НейроКонтур» строго реализован принцип «Человек в контуре управления» (Human-in-the-Loop):</w:t>
       </w:r>
     </w:p>
     <w:p>
@@ -2195,7 +2256,7 @@
           <w:rFonts w:ascii="Arial" w:hAnsi="Arial"/>
           <w:sz w:val="19"/>
         </w:rPr>
-        <w:t>ИИ формирует рекомендацию: Алгоритм оценивает вероятность ложной тревоги (P_false) и деградации оборудования, рассчитывает уровень уверенности и выводит объясняющие факторы (Feature Importance).</w:t>
+        <w:t>Модель выдаёт риск-оценку и доступные факторы признаков. Рекомендация и объяснение не подтверждены техническим специалистом и не устанавливают причину события.</w:t>
       </w:r>
     </w:p>
     <w:p>
@@ -2208,7 +2269,7 @@
           <w:rFonts w:ascii="Arial" w:hAnsi="Arial"/>
           <w:sz w:val="19"/>
         </w:rPr>
-        <w:t>Диспетчер принимает решение (RBAC): Перед подтверждением отмены ложной тревоги или переквалификацией инцидента диспетчер обязан авторизоваться по табельному номеру из реестра ОДС (например, ДИСП-7041) с автоматической верификацией прав допуска.</w:t>
+        <w:t>Для некоторых действий прототип запрашивает demo-ИД и шестизначный PIN из локально настроенного реестра. Это демонстрационная проверка реквизитов, а не корпоративная аутентификация, полноценная 2FA или подтверждение роли в ОДС.</w:t>
       </w:r>
     </w:p>
     <w:p>
@@ -2221,7 +2282,7 @@
           <w:rFonts w:ascii="Arial" w:hAnsi="Arial"/>
           <w:sz w:val="19"/>
         </w:rPr>
-        <w:t>Нестираемый криптографический реестр аудита (SHA-256 Ledger): Все подтверждения сохраняются в базе данных с криптографическим хэшированием цепочки блоков SHA-256 (ГОСТ Р 53195-2014). Ни один аварийный выезд не может быть заблокирован системой автоматически, а любая попытка изменения журнала детектируется эндпоинтом /api/alarms/audit/verify.</w:t>
+        <w:t>Локальный журнал и SHA-256 механизм предназначены для демонстрации фиксации действий. Они не заявляются как сертифицированный, неизменяемый или соответствующий ГОСТ журнал аудита.</w:t>
       </w:r>
     </w:p>
     <w:p>
@@ -2230,13 +2291,7 @@
         <w:spacing w:before="360" w:after="120"/>
       </w:pPr>
       <w:r>
-        <w:rPr>
-          <w:rFonts w:ascii="Arial" w:hAnsi="Arial"/>
-          <w:b/>
-          <w:color w:val="1C1D22"/>
-          <w:sz w:val="30"/>
-        </w:rPr>
-        <w:t>7. Автоматизация ремонтно-восстановительных работ по Р ТЭК</w:t>
+        <w:t>7. Автоматизация ремонтно-восстановительных работ по отраслевому регламенту ТОиР</w:t>
       </w:r>
     </w:p>
     <w:p>
@@ -2244,12 +2299,7 @@
         <w:spacing w:after="80" w:line="276" w:lineRule="auto"/>
       </w:pPr>
       <w:r>
-        <w:rPr>
-          <w:rFonts w:ascii="Arial" w:hAnsi="Arial"/>
-          <w:color w:val="282828"/>
-          <w:sz w:val="19"/>
-        </w:rPr>
-        <w:t>В соответствии с Регламентом технической эксплуатации коммуникационных коллекторов (Р ТЭК) любые работы в подземных сооружениях требуют жесткой регламентации допуска, специализированного состава бригад и учета материалов.</w:t>
+        <w:t>Рекомендации по техническому обслуживанию и наряд-заказы в прототипе демонстрационные. Их нельзя считать подтверждённым применением регламента отраслевому регламенту ТОиР или согласованной производственной инструкцией.</w:t>
       </w:r>
     </w:p>
     <w:p>
@@ -2277,7 +2327,7 @@
           <w:color w:val="282828"/>
           <w:sz w:val="19"/>
         </w:rPr>
-        <w:t>В исходных данных телеметрии координаты датчиков закодированы в диспетчерских тегах (например, `МК-2.2.2.2.2.14`). Нами разработан алгоритмический парсер, извлекающий из тегов линейный пикетаж коллектора (ПК1–ПК120). Это позволяет моментально локализовать место потенциального инцидента с точностью до 10-метрового отсека коллектора.</w:t>
+        <w:t>Пикетаж и координаты на карте условные. Прототип не содержит проверенной геопривязки каналов к реальной сети и не предназначен для поиска места работ бригадой.</w:t>
       </w:r>
     </w:p>
     <w:p>
@@ -2306,7 +2356,7 @@
           <w:color w:val="191919"/>
           <w:sz w:val="19"/>
         </w:rPr>
-        <w:t xml:space="preserve">Параметры наряд-заказа: </w:t>
+        <w:t>Некоторые сценарии формируют черновик заявки локального демо. Создание черновика не подтверждает выполнение работ, выезд, расход материалов или закрытие заявки в системе заказчика.</w:t>
       </w:r>
       <w:r>
         <w:rPr>
@@ -2314,7 +2364,6 @@
           <w:color w:val="282828"/>
           <w:sz w:val="19"/>
         </w:rPr>
-        <w:t>При подтверждении предаварийного риска деградации датчика система автоматически формирует предзаполненный наряд-заказ:</w:t>
       </w:r>
     </w:p>
     <w:p>
@@ -2327,7 +2376,7 @@
           <w:rFonts w:ascii="Arial" w:hAnsi="Arial"/>
           <w:sz w:val="19"/>
         </w:rPr>
-        <w:t>Профильная служба: Датчики метана/газа/дыма/температуры -&gt; Служба КИПиА; Насосы/вентиляторы -&gt; Электротехническая служба; Контакты люков/дверей -&gt; Строительно-эксплуатационная служба.</w:t>
+        <w:t>Назначение профильной службы показано как пример интерфейсного workflow; правила распределения не согласованы с заказчиком и не проверены на фактических нарядах.</w:t>
       </w:r>
     </w:p>
     <w:p>
@@ -2340,7 +2389,7 @@
           <w:rFonts w:ascii="Arial" w:hAnsi="Arial"/>
           <w:sz w:val="19"/>
         </w:rPr>
-        <w:t>Спецификация ЗИП и материалов: Автоматический расчет необходимых запасных частей (герконовый датчик МК, соединительная муфта, уплотнитель люка, кабель сигнальный 15м, газоанализатор поверенный).</w:t>
+        <w:t>Список запасных частей и материалов в демонстрации не подтверждён складскими каталогами и техническими регламентами заказчика.</w:t>
       </w:r>
     </w:p>
     <w:p>
@@ -2353,7 +2402,7 @@
           <w:rFonts w:ascii="Arial" w:hAnsi="Arial"/>
           <w:sz w:val="19"/>
         </w:rPr>
-        <w:t>Трудозатраты и нормативы: Нормативное время выполнения ТО — 2.5 нормо-часа, регламентная стоимость — 3 200 рублей.</w:t>
+        <w:t>Временные и денежные значения обслуживания — сценарные вводные, а не подтверждённые нормы или цены заказчика.</w:t>
       </w:r>
     </w:p>
     <w:p>
@@ -2381,7 +2430,7 @@
           <w:color w:val="282828"/>
           <w:sz w:val="19"/>
         </w:rPr>
-        <w:t>Экономическая модель комплекса «НейроКонтур» базируется на замещении дорогостоящих экстренных аварийных выездов плановым предупредительным обслуживанием датчиков и снижением потерь от холостых выездов дежурных сил ОДС.</w:t>
+        <w:t>Экономический пример ниже — сценарная арифметика на вводных, которые не подтверждены бухгалтерскими данными, тарифами или статистикой выездов заказчика. Он не показывает реализованную экономию.</w:t>
       </w:r>
     </w:p>
     <w:tbl>
@@ -2404,6 +2453,9 @@
         <w:gridCol w:w="3106"/>
       </w:tblGrid>
       <w:tr>
+        <w:trPr>
+          <w:cantSplit/>
+        </w:trPr>
         <w:tc>
           <w:tcPr>
             <w:tcW w:type="dxa" w:w="3106"/>
@@ -2421,7 +2473,7 @@
                 <w:b/>
                 <w:sz w:val="17"/>
               </w:rPr>
-              <w:t>Статья затрат / Показатель</w:t>
+              <w:t>Параметр сценария</w:t>
             </w:r>
           </w:p>
         </w:tc>
@@ -2442,7 +2494,7 @@
                 <w:b/>
                 <w:sz w:val="17"/>
               </w:rPr>
-              <w:t>Без применения ИИ (Базовый сценарий)</w:t>
+              <w:t>Условная вводная</w:t>
             </w:r>
           </w:p>
         </w:tc>
@@ -2463,12 +2515,15 @@
                 <w:b/>
                 <w:sz w:val="17"/>
               </w:rPr>
-              <w:t>С комплексом «НейроКонтур»</w:t>
+              <w:t>Ограничение</w:t>
             </w:r>
           </w:p>
         </w:tc>
       </w:tr>
       <w:tr>
+        <w:trPr>
+          <w:cantSplit/>
+        </w:trPr>
         <w:tc>
           <w:tcPr>
             <w:tcW w:type="dxa" w:w="3106"/>
@@ -2484,7 +2539,7 @@
               <w:rPr>
                 <w:sz w:val="17"/>
               </w:rPr>
-              <w:t>Стоимость экстренного выезда аварийной бригады</w:t>
+              <w:t>Стоимость выезда</w:t>
             </w:r>
           </w:p>
         </w:tc>
@@ -2503,7 +2558,7 @@
               <w:rPr>
                 <w:sz w:val="17"/>
               </w:rPr>
-              <w:t>18 500 ₽ за 1 выезд</w:t>
+              <w:t>18 500 ₽</w:t>
             </w:r>
           </w:p>
         </w:tc>
@@ -2522,12 +2577,15 @@
               <w:rPr>
                 <w:sz w:val="17"/>
               </w:rPr>
-              <w:t>Исключается до 82.4% холостых выездов</w:t>
+              <w:t>Источник и применимость не подтверждены</w:t>
             </w:r>
           </w:p>
         </w:tc>
       </w:tr>
       <w:tr>
+        <w:trPr>
+          <w:cantSplit/>
+        </w:trPr>
         <w:tc>
           <w:tcPr>
             <w:tcW w:type="dxa" w:w="3106"/>
@@ -2543,7 +2601,7 @@
               <w:rPr>
                 <w:sz w:val="17"/>
               </w:rPr>
-              <w:t>Стоимость планового предупредительного ТО</w:t>
+              <w:t>Стоимость планового ТО</w:t>
             </w:r>
           </w:p>
         </w:tc>
@@ -2562,7 +2620,7 @@
               <w:rPr>
                 <w:sz w:val="17"/>
               </w:rPr>
-              <w:t>— (ремонт по факту аварии)</w:t>
+              <w:t>3 200 ₽</w:t>
             </w:r>
           </w:p>
         </w:tc>
@@ -2581,12 +2639,15 @@
               <w:rPr>
                 <w:sz w:val="17"/>
               </w:rPr>
-              <w:t>3 200 ₽ за регламентную наладку датчика</w:t>
+              <w:t>Не подтверждённый тариф/норматив</w:t>
             </w:r>
           </w:p>
         </w:tc>
       </w:tr>
       <w:tr>
+        <w:trPr>
+          <w:cantSplit/>
+        </w:trPr>
         <w:tc>
           <w:tcPr>
             <w:tcW w:type="dxa" w:w="3106"/>
@@ -2602,7 +2663,7 @@
               <w:rPr>
                 <w:sz w:val="17"/>
               </w:rPr>
-              <w:t>Чистая экономия на 1 предотвращенном ложном выезде</w:t>
+              <w:t>Разница в примере</w:t>
             </w:r>
           </w:p>
         </w:tc>
@@ -2621,7 +2682,7 @@
               <w:rPr>
                 <w:sz w:val="17"/>
               </w:rPr>
-              <w:t>0 ₽</w:t>
+              <w:t>15 300 ₽ на условный случай</w:t>
             </w:r>
           </w:p>
         </w:tc>
@@ -2640,12 +2701,15 @@
               <w:rPr>
                 <w:sz w:val="17"/>
               </w:rPr>
-              <w:t>15 300 ₽ чистой экономии</w:t>
+              <w:t>Не измеренная экономия</w:t>
             </w:r>
           </w:p>
         </w:tc>
       </w:tr>
       <w:tr>
+        <w:trPr>
+          <w:cantSplit/>
+        </w:trPr>
         <w:tc>
           <w:tcPr>
             <w:tcW w:type="dxa" w:w="3106"/>
@@ -2661,7 +2725,7 @@
               <w:rPr>
                 <w:sz w:val="17"/>
               </w:rPr>
-              <w:t>Годовой экономический эффект (OPEX)</w:t>
+              <w:t>Годовой диапазон при 230–310 случаях/мес.</w:t>
             </w:r>
           </w:p>
         </w:tc>
@@ -2680,7 +2744,7 @@
               <w:rPr>
                 <w:sz w:val="17"/>
               </w:rPr>
-              <w:t>0 ₽ (базовые затраты)</w:t>
+              <w:t>42,2–56,9 млн ₽/год (арифметическая оценка)</w:t>
             </w:r>
           </w:p>
         </w:tc>
@@ -2700,7 +2764,7 @@
                 <w:b/>
                 <w:sz w:val="17"/>
               </w:rPr>
-              <w:t>48 600 000 – 57 100 000 ₽ / год</w:t>
+              <w:t>Частота, предотвращаемая доля и эффект не проверены; ROI/payback не рассчитывались</w:t>
             </w:r>
           </w:p>
         </w:tc>
@@ -2716,7 +2780,7 @@
           <w:color w:val="282828"/>
           <w:sz w:val="19"/>
         </w:rPr>
-        <w:t>При ориентировочной стоимости развертывания и интеграции программного комплекса в инфраструктуру АО «Москоллектор» в объеме 8.5–10.0 млн ₽ расчетный срок окупаемости инвестиций (Payback Period) составляет менее 3 месяцев, а коэффициент возврата инвестиций (ROI) за первый год промышленной эксплуатации превышает 450%.</w:t>
+        <w:t>При условных 230–310 случаях в месяц, разнице 15 300 ₽ между вводами 18 500 ₽ и 3 200 ₽, арифметический диапазон равен 42,2–56,9 млн ₽ в год. Не подтверждены ни сами вводные, ни доля случаев, которые можно изменить; стоимость внедрения, окупаемость и ROI не рассчитаны.</w:t>
       </w:r>
     </w:p>
     <w:p>
@@ -2744,7 +2808,7 @@
           <w:color w:val="282828"/>
           <w:sz w:val="19"/>
         </w:rPr>
-        <w:t>Объекты АО «Москоллектор» относятся к критической информационной инфраструктуре (КИИ) Российской Федерации. Комплекс «НейроКонтур» спроектирован с безусловным соблюдением федерального законодательства:</w:t>
+        <w:t>Прототип не проходил оценку соответствия 149-ФЗ, 152-ФЗ, требованиям КИИ или стандартам. Настоящий документ не является юридическим заключением или подтверждением выполнения обязательных требований.</w:t>
       </w:r>
     </w:p>
     <w:p>
@@ -2757,7 +2821,7 @@
           <w:rFonts w:ascii="Arial" w:hAnsi="Arial"/>
           <w:sz w:val="19"/>
         </w:rPr>
-        <w:t>149-ФЗ «Об информации, информационных технологиях и о защите информации»: Интеграция с АСУ ТП и SCADA-системами Москоллектора осуществляется строго в режиме «только чтение» (Read-Only). Комплекс не имеет доступа к прямому управлению запорной арматурой, задвижками или подачей питания.</w:t>
+        <w:t>В рабочие SCADA/АСУ ТП АО «Москоллектор» интеграции нет. Локальный интерфейс не подключён к управлению оборудованием; режимы доступа производственной системы не испытывались.</w:t>
       </w:r>
     </w:p>
     <w:p>
@@ -2770,7 +2834,7 @@
           <w:rFonts w:ascii="Arial" w:hAnsi="Arial"/>
           <w:sz w:val="19"/>
         </w:rPr>
-        <w:t>Защита пространственных сведений о КИИ: Точные географические координаты подземных коллекторов являются сведениями ограниченного доступа. В демонстрационном контуре и пользовательском интерфейсе Leaflet ГИС используется безопасная синтетическая топология сети с сохранением относительного пикетажа (ПК1–120) и топологической связности, исключающая утечку критических геоданных.</w:t>
+        <w:t>Карта в демо использует условную топологию. Она не должна интерпретироваться как точная карта коллекторов или как результат проверки режима обращения с геоданными заказчика.</w:t>
       </w:r>
     </w:p>
     <w:p>
@@ -2783,7 +2847,7 @@
           <w:rFonts w:ascii="Arial" w:hAnsi="Arial"/>
           <w:sz w:val="19"/>
         </w:rPr>
-        <w:t>152-ФЗ «О персональных данных»: Система не собирает, не обрабатывает и не передает персональные данные сотрудников. В аудит-логе фиксируются исключительно обезличенные табельные номера диспетчеров ОДС.</w:t>
+        <w:t>Наличие demo-ИД в локальном сценарии означает, что проектные файлы и журнал могут содержать тестовые идентификаторы. Для пилота состав данных, доступ, хранение и обработку персональных данных нужно отдельно согласовать и оценить.</w:t>
       </w:r>
     </w:p>
     <w:p>
@@ -2796,7 +2860,7 @@
           <w:rFonts w:ascii="Arial" w:hAnsi="Arial"/>
           <w:sz w:val="19"/>
         </w:rPr>
-        <w:t>Air-Gapped изоляция: Программный комплекс полностью автономен, не требует доступа к сети Интернет, внешним CDN или облачным сервисам, что исключает угрозы внешнего несанкционированного доступа.</w:t>
+        <w:t>Air-gap, отказ от внешних сервисов и безопасность развёртывания в закрытой сети заказчика не проверялись. Эти свойства нужно подтвердить отдельным проектированием и испытаниями.</w:t>
       </w:r>
     </w:p>
     <w:p>
@@ -2824,7 +2888,7 @@
           <w:color w:val="282828"/>
           <w:sz w:val="19"/>
         </w:rPr>
-        <w:t>Программный комплекс поставляется с полной конфигурацией контейнеризации Docker и готовыми скриптами автоматического запуска.</w:t>
+        <w:t>Инструкции ниже предназначены для запуска локальной демонстрации. Перед запуском ознакомьтесь с актуальным README.md; контейнеризацию и эксплуатацию в production следует проверять отдельно.</w:t>
       </w:r>
     </w:p>
     <w:p>
@@ -2839,7 +2903,7 @@
           <w:color w:val="DC1446"/>
           <w:sz w:val="25"/>
         </w:rPr>
-        <w:t>Вариант 1. Запуск в Docker-контейнере (Рекомендуемый для продакшн)</w:t>
+        <w:t>Вариант 1. Локальный запуск в Docker</w:t>
       </w:r>
     </w:p>
     <w:p>
@@ -2853,7 +2917,7 @@
           <w:color w:val="191919"/>
           <w:sz w:val="19"/>
         </w:rPr>
-        <w:t xml:space="preserve">Команда сборки: </w:t>
+        <w:t>Команда из корневого каталога запускает локальный стенд согласно README, если установлены зависимости и требуемые данные. Это не production-конфигурация.</w:t>
       </w:r>
       <w:r>
         <w:rPr>
@@ -2861,7 +2925,6 @@
           <w:color w:val="282828"/>
           <w:sz w:val="19"/>
         </w:rPr>
-        <w:t>Для сборки и запуска изолированного контейнера выполните команду в корневом каталоге проекта:</w:t>
       </w:r>
     </w:p>
     <w:p>
@@ -2887,7 +2950,7 @@
           <w:color w:val="282828"/>
           <w:sz w:val="19"/>
         </w:rPr>
-        <w:t>После запуска веб-интерфейс ОДС доступен по адресу: http://localhost:8000 (автоматически проксирует API и статику).</w:t>
+        <w:t>Адрес интерфейса и API зависит от локальной конфигурации запуска; актуальные адреса указаны в README.</w:t>
       </w:r>
     </w:p>
     <w:p>
@@ -2915,7 +2978,7 @@
           <w:color w:val="282828"/>
           <w:sz w:val="19"/>
         </w:rPr>
-        <w:t>На платформе Windows запуск осуществляется одним кликом через скрипт `run_local.bat`:</w:t>
+        <w:t>Вариант 2. Локальный запуск Windows / Linux</w:t>
       </w:r>
     </w:p>
     <w:p>
@@ -2928,7 +2991,7 @@
           <w:rFonts w:ascii="Arial" w:hAnsi="Arial"/>
           <w:sz w:val="19"/>
         </w:rPr>
-        <w:t>1. Установка зависимостей: pip install -r requirements.txt</w:t>
+        <w:t>Установите зависимости по актуальным инструкциям README. Перед повторным обучением проверьте наличие локальных исходных данных и кэша признаков.</w:t>
       </w:r>
     </w:p>
     <w:p>
@@ -2941,7 +3004,7 @@
           <w:rFonts w:ascii="Arial" w:hAnsi="Arial"/>
           <w:sz w:val="19"/>
         </w:rPr>
-        <w:t>2. Сборка фронтенда: cd frontend &amp;&amp; npm.cmd install &amp;&amp; npm.cmd run build &amp;&amp; cd ..</w:t>
+        <w:t>Соберите frontend из каталога frontend командами package manager, указанными в README.</w:t>
       </w:r>
     </w:p>
     <w:p>
@@ -2954,7 +3017,7 @@
           <w:rFonts w:ascii="Arial" w:hAnsi="Arial"/>
           <w:sz w:val="19"/>
         </w:rPr>
-        <w:t>3. Запуск веб-сервера: python -m uvicorn backend.app.main:app --host 0.0.0.0 --port 8000</w:t>
+        <w:t>Запустите backend локально согласно README. Параметры bind-адреса и доступ из сети нужно выбирать только для локального сценария.</w:t>
       </w:r>
     </w:p>
     <w:p>
@@ -2982,7 +3045,7 @@
           <w:color w:val="282828"/>
           <w:sz w:val="19"/>
         </w:rPr>
-        <w:t>Пакет автоматических тестов API, ML-скоринга и подтверждения тревог запускается командой:</w:t>
+        <w:t>Проверка API запускается отдельной командой; количество пропусков зависит от локальной настройки demo-учётных данных.</w:t>
       </w:r>
     </w:p>
     <w:p>
@@ -3008,7 +3071,7 @@
           <w:color w:val="282828"/>
           <w:sz w:val="19"/>
         </w:rPr>
-        <w:t>Результат: 14 из 14 тестов успешно пройдены (Status: PASSED 100%).</w:t>
+        <w:t>В недавнем прогоне изолированной копии с локальными demo-реквизитами прошло 27 тестов (один warning Starlette); без реквизитов прошло 20 тестов, 7 проверок авторизованных изменений пропущены. Для подробностей локальной настройки см. README. Это результат конкретного прогона, не гарантия для другого окружения.</w:t>
       </w:r>
     </w:p>
     <w:p>
@@ -3036,7 +3099,7 @@
           <w:color w:val="282828"/>
           <w:sz w:val="19"/>
         </w:rPr>
-        <w:t>Комплекс предоставляет документированный OpenAPI (Swagger) интерфейс по адресу `http://localhost:8000/docs`.</w:t>
+        <w:t>OpenAPI/Swagger доступен при локально запущенном API; путь и порт указаны в README.</w:t>
       </w:r>
     </w:p>
     <w:tbl>
@@ -3059,6 +3122,9 @@
         <w:gridCol w:w="3106"/>
       </w:tblGrid>
       <w:tr>
+        <w:trPr>
+          <w:cantSplit/>
+        </w:trPr>
         <w:tc>
           <w:tcPr>
             <w:tcW w:type="dxa" w:w="3106"/>
@@ -3124,6 +3190,9 @@
         </w:tc>
       </w:tr>
       <w:tr>
+        <w:trPr>
+          <w:cantSplit/>
+        </w:trPr>
         <w:tc>
           <w:tcPr>
             <w:tcW w:type="dxa" w:w="3106"/>
@@ -3183,6 +3252,9 @@
         </w:tc>
       </w:tr>
       <w:tr>
+        <w:trPr>
+          <w:cantSplit/>
+        </w:trPr>
         <w:tc>
           <w:tcPr>
             <w:tcW w:type="dxa" w:w="3106"/>
@@ -3242,6 +3314,9 @@
         </w:tc>
       </w:tr>
       <w:tr>
+        <w:trPr>
+          <w:cantSplit/>
+        </w:trPr>
         <w:tc>
           <w:tcPr>
             <w:tcW w:type="dxa" w:w="3106"/>
@@ -3301,6 +3376,9 @@
         </w:tc>
       </w:tr>
       <w:tr>
+        <w:trPr>
+          <w:cantSplit/>
+        </w:trPr>
         <w:tc>
           <w:tcPr>
             <w:tcW w:type="dxa" w:w="3106"/>
@@ -3354,12 +3432,15 @@
               <w:rPr>
                 <w:sz w:val="17"/>
               </w:rPr>
-              <w:t>События с подозрением на дребезг контактов и наводки.</w:t>
+              <w:t>Выдаёт кандидатов для просмотра; не подтверждает ложность тревоги</w:t>
             </w:r>
           </w:p>
         </w:tc>
       </w:tr>
       <w:tr>
+        <w:trPr>
+          <w:cantSplit/>
+        </w:trPr>
         <w:tc>
           <w:tcPr>
             <w:tcW w:type="dxa" w:w="3106"/>
@@ -3413,12 +3494,15 @@
               <w:rPr>
                 <w:sz w:val="17"/>
               </w:rPr>
-              <w:t>Вход: alarm_id, badge_number, decision (confirm_false/dispatch).</w:t>
+              <w:t>Требует demo-ИД/PIN для локального действия; это не корпоративная аутентификация</w:t>
             </w:r>
           </w:p>
         </w:tc>
       </w:tr>
       <w:tr>
+        <w:trPr>
+          <w:cantSplit/>
+        </w:trPr>
         <w:tc>
           <w:tcPr>
             <w:tcW w:type="dxa" w:w="3106"/>
@@ -3472,12 +3556,15 @@
               <w:rPr>
                 <w:sz w:val="17"/>
               </w:rPr>
-              <w:t>Управление порогом tau, окном дребезга, тарифами ТО и выезда.</w:t>
+              <w:t>Чтение/изменение локальных demo-параметров; тарифы и пороги не нормативны</w:t>
             </w:r>
           </w:p>
         </w:tc>
       </w:tr>
       <w:tr>
+        <w:trPr>
+          <w:cantSplit/>
+        </w:trPr>
         <w:tc>
           <w:tcPr>
             <w:tcW w:type="dxa" w:w="3106"/>
@@ -3531,7 +3618,7 @@
               <w:rPr>
                 <w:sz w:val="17"/>
               </w:rPr>
-              <w:t>Число предотвращенных аварий, подтвержденная экономия, наряды.</w:t>
+              <w:t>Сводка локальных событий/сценарных сумм; не число предотвращённых аварий или подтверждённая экономия</w:t>
             </w:r>
           </w:p>
         </w:tc>
@@ -3562,7 +3649,7 @@
           <w:color w:val="282828"/>
           <w:sz w:val="19"/>
         </w:rPr>
-        <w:t>Предлагаемый поэтапный план интеграции комплекса «Москоллектор.НейроКонтур» в диспетчерский контур предприятия:</w:t>
+        <w:t>Следующие шаги — предложение для обсуждения, а не согласованный заказчиком план пилота. До пилота нужны доступ к подтверждённым данным, критерии сравнения с фактическими исходами, регламенты, оценка безопасности и письменное согласование.</w:t>
       </w:r>
     </w:p>
     <w:p>
@@ -3575,7 +3662,7 @@
           <w:rFonts w:ascii="Arial" w:hAnsi="Arial"/>
           <w:sz w:val="19"/>
         </w:rPr>
-        <w:t>Этап 1 (1–14 дни): Развертывание Docker-контейнера в закрытом контуре ОДС, настройка зеркалирования телеметрии СМВУ в режиме Read-only.</w:t>
+        <w:t>Этап 1: согласовать состав данных, допустимый режим доступа, локальное provisioning demo-учёток и критерии аудита.</w:t>
       </w:r>
     </w:p>
     <w:p>
@@ -3588,7 +3675,7 @@
           <w:rFonts w:ascii="Arial" w:hAnsi="Arial"/>
           <w:sz w:val="19"/>
         </w:rPr>
-        <w:t>Этап 2 (15–45 дни): Пилотная опытная эксплуатация на 2 пилотных РЭК (Районах эксплуатации коллекторов) в режиме суфлера диспетчера.</w:t>
+        <w:t>Этап 2: провести ограниченный тест на копии/потоке данных, предоставленном и разрешённом заказчиком; решения специалистов не автоматизировать.</w:t>
       </w:r>
     </w:p>
     <w:p>
@@ -3601,7 +3688,7 @@
           <w:rFonts w:ascii="Arial" w:hAnsi="Arial"/>
           <w:sz w:val="19"/>
         </w:rPr>
-        <w:t>Этап 3 (45–90 дни): Калибровка порогов отсечки tau по реальным выездам, интеграция со смежными системами документооборота и наряд-допусков.</w:t>
+        <w:t>Этап 3: сравнить proxy-прогнозы с реальными ремонтами и диспетчерскими решениями; оценить рекомендации, ошибки и экономику по подтверждённым данным.</w:t>
       </w:r>
     </w:p>
     <w:p>
@@ -3614,7 +3701,7 @@
           <w:rFonts w:ascii="Arial" w:hAnsi="Arial"/>
           <w:sz w:val="19"/>
         </w:rPr>
-        <w:t>Этап 4 (2027 год): Масштабирование на все 825 км коллекторов Москвы, подключение виброакустических датчиков и тепловизионного контроля.</w:t>
+        <w:t>Этап 4: решение о масштабировании принимать только после отдельного согласования результатов, интеграций, требований безопасности и финансирования.</w:t>
       </w:r>
     </w:p>
     <w:sectPr>

</xml_diff>

<commit_message>
docs: audit fixes — no RUB savings claims, honest S8 and top-200 wording, slide 5 reframed
</commit_message>
<xml_diff>
--- a/docs/Пояснительная_записка_Москоллектор_НейроКонтур.docx
+++ b/docs/Пояснительная_записка_Москоллектор_НейроКонтур.docx
@@ -6345,7 +6345,7 @@
                 <w:color w:val="1C1D22"/>
                 <w:sz w:val="18"/>
               </w:rPr>
-              <w:t>Честный вывод. Модель, стоящая в демо (обучена в январе и не переобучалась), слабее простого правила: правило лучше или равно в большинстве недель по ROC-AUC и по точности в топе. Модель с еженедельным переобучением заметно лучше по ROC-AUC и PR-AUC, на топ-100 примерно равна правилу, на топ-200 уступает. Практическая ценность модели — в каналах, где правило слепо: события в таких каналах составляют 59 % всех событий за период (2 393 из 4 027), именно они определяют, сколько проблем выявляется заранее. Поэтому на пилоте мы закладываем еженедельное переобучение и сравнение с правилом на актах ТОИР, а не обещаем цифры демо.</w:t>
+              <w:t>Честный вывод. Модель, стоящая в демо (обучена в январе и не переобучалась), слабее простого правила: правило лучше или равно в большинстве недель по ROC-AUC и по точности в топе. Модель с еженедельным переобучением заметно лучше по ROC-AUC и PR-AUC (18 недель из 21), на топ-100 примерно равна правилу, на топ-200 медиана ниже (24 % против 28 %), хотя по неделям модель выше в 12 из 21. Практическая ценность модели — в каналах, где правило слепо: события в таких каналах составляют 59 % всех событий за период (2 393 из 4 027), именно они определяют, сколько проблем выявляется заранее. Поэтому на пилоте мы закладываем еженедельное переобучение и сравнение с правилом на актах ТОИР, а не обещаем цифры демо.</w:t>
             </w:r>
           </w:p>
         </w:tc>
@@ -8666,7 +8666,7 @@
           <w:color w:val="1C1D22"/>
           <w:sz w:val="20"/>
         </w:rPr>
-        <w:t>Сценарий S8 моделирует газ, который «гуляет» около порога 1 %: статический порог без гистерезиса превращает его в десятки оповещений. Быстрый контур выдаёт 3 оповещения на событие (газовое предупреждение, рост газа и пометка «колебание у уставки») и помечает инцидент как колебание у уставки (100 % случаев); наивный порог даёт 15 оповещений на событие.</w:t>
+        <w:t>Сценарий S8 моделирует газ, который «гуляет» около порога 1 %. Наивный порог даёт на одно такое событие 15 оповещений. Статический порог с дедупликацией сводит это к 1 оповещению и 1 инциденту, но не распознаёт колебание как отдельную аномалию и не напоминает о ней. Быстрый контур выдаёт 3 оповещения и 3 инцидента на событие (газовое предупреждение, рост газа, колебание у уставки) и помечает инцидент как колебание у уставки (100 % случаев). Три инцидента вместо одного — известное отклонение от спецификации (№8): детектор не подгонялся под результат, ограничение зафиксировано.</w:t>
       </w:r>
     </w:p>
     <w:p>

</xml_diff>

<commit_message>
docs: test count 112 in README, note, methodology and deck
</commit_message>
<xml_diff>
--- a/docs/Пояснительная_записка_Москоллектор_НейроКонтур.docx
+++ b/docs/Пояснительная_записка_Москоллектор_НейроКонтур.docx
@@ -486,7 +486,7 @@
                 <w:color w:val="1C1D22"/>
                 <w:sz w:val="18"/>
               </w:rPr>
-              <w:t>Рабочий прототип: REST API, веб-интерфейс двух ролей, 108 автотестов; подключения к СМВУ и CMMS заказчика нет (интеграция описана в п. 9)</w:t>
+              <w:t>Рабочий прототип: REST API, веб-интерфейс двух ролей, 112 автотестов; подключения к СМВУ и CMMS заказчика нет (интеграция описана в п. 9)</w:t>
             </w:r>
           </w:p>
         </w:tc>
@@ -2386,7 +2386,7 @@
                 <w:color w:val="1C1D22"/>
                 <w:sz w:val="17"/>
               </w:rPr>
-              <w:t>108 автотестов: API, калибровка, бэктест, синтетический пайплайн, Сценарный полигон</w:t>
+              <w:t>112 автотестов: API, калибровка, бэктест, синтетический пайплайн, Сценарный полигон</w:t>
             </w:r>
           </w:p>
         </w:tc>
@@ -12106,7 +12106,7 @@
                 <w:color w:val="1C1D22"/>
                 <w:sz w:val="17"/>
               </w:rPr>
-              <w:t>108 автотестов (API, калибровка, бэктест, Сценарный полигон)</w:t>
+              <w:t>112 автотестов (API, калибровка, бэктест, Сценарный полигон)</w:t>
             </w:r>
           </w:p>
         </w:tc>

</xml_diff>